<commit_message>
maj base de donnees
</commit_message>
<xml_diff>
--- a/MemoireL3.docx
+++ b/MemoireL3.docx
@@ -445,21 +445,8 @@
         <w:pStyle w:val="Titre3"/>
       </w:pPr>
       <w:r>
-        <w:t xml:space="preserve">4.1 </w:t>
-      </w:r>
-      <w:proofErr w:type="spellStart"/>
-      <w:r>
-        <w:t>Analyse</w:t>
-      </w:r>
-      <w:proofErr w:type="spellEnd"/>
-      <w:r>
-        <w:t xml:space="preserve"> de </w:t>
-      </w:r>
-      <w:proofErr w:type="spellStart"/>
-      <w:r>
-        <w:t>l'existant</w:t>
-      </w:r>
-      <w:proofErr w:type="spellEnd"/>
+        <w:t>4.1 Analyse de l'existant</w:t>
+      </w:r>
     </w:p>
     <w:p>
       <w:pPr>
@@ -1104,15 +1091,7 @@
         <w:pStyle w:val="Titre3"/>
       </w:pPr>
       <w:r>
-        <w:t xml:space="preserve">4.2 </w:t>
-      </w:r>
-      <w:proofErr w:type="spellStart"/>
-      <w:r>
-        <w:t>Choix</w:t>
-      </w:r>
-      <w:proofErr w:type="spellEnd"/>
-      <w:r>
-        <w:t xml:space="preserve"> de la solution</w:t>
+        <w:t>4.2 Choix de la solution</w:t>
       </w:r>
     </w:p>
     <w:p>
@@ -1281,15 +1260,7 @@
         <w:pStyle w:val="NormalWeb"/>
       </w:pPr>
       <w:r>
-        <w:t xml:space="preserve">La solution prévoit un module d’évaluation permettant de proposer des questionnaires en ligne, notamment sous forme de questions à choix multiples (QCM). Ce module doit permettre de </w:t>
-      </w:r>
-      <w:proofErr w:type="gramStart"/>
-      <w:r>
-        <w:t>gérer</w:t>
-      </w:r>
-      <w:proofErr w:type="gramEnd"/>
-      <w:r>
-        <w:t xml:space="preserve"> les questions et les choix de réponse, de calculer les notes obtenues et de conserver l’historique des tentatives d’évaluation.</w:t>
+        <w:t>La solution prévoit un module d’évaluation permettant de proposer des questionnaires en ligne, notamment sous forme de questions à choix multiples (QCM). Ce module doit permettre de gérer les questions et les choix de réponse, de calculer les notes obtenues et de conserver l’historique des tentatives d’évaluation.</w:t>
       </w:r>
     </w:p>
     <w:p>
@@ -1816,23 +1787,7 @@
         </w:rPr>
       </w:pPr>
       <w:r>
-        <w:t xml:space="preserve">5.1. </w:t>
-      </w:r>
-      <w:proofErr w:type="spellStart"/>
-      <w:r>
-        <w:t>Présentation</w:t>
-      </w:r>
-      <w:proofErr w:type="spellEnd"/>
-      <w:r>
-        <w:t xml:space="preserve"> de la </w:t>
-      </w:r>
-      <w:proofErr w:type="spellStart"/>
-      <w:r>
-        <w:t>méthode</w:t>
-      </w:r>
-      <w:proofErr w:type="spellEnd"/>
-      <w:r>
-        <w:t xml:space="preserve"> de conception</w:t>
+        <w:t>5.1. Présentation de la méthode de conception</w:t>
       </w:r>
     </w:p>
     <w:p>
@@ -1952,21 +1907,8 @@
         </w:rPr>
       </w:pPr>
       <w:r>
-        <w:t xml:space="preserve">5.2. </w:t>
-      </w:r>
-      <w:proofErr w:type="spellStart"/>
-      <w:r>
-        <w:t>Dictionnaire</w:t>
-      </w:r>
-      <w:proofErr w:type="spellEnd"/>
-      <w:r>
-        <w:t xml:space="preserve"> des </w:t>
-      </w:r>
-      <w:proofErr w:type="spellStart"/>
-      <w:r>
-        <w:t>données</w:t>
-      </w:r>
-      <w:proofErr w:type="spellEnd"/>
+        <w:t>5.2. Dictionnaire des données</w:t>
+      </w:r>
     </w:p>
     <w:p>
       <w:pPr>
@@ -5204,35 +5146,7 @@
         <w:rPr>
           <w:rStyle w:val="Titre3Car"/>
         </w:rPr>
-        <w:t xml:space="preserve">5.2.2. </w:t>
-      </w:r>
-      <w:proofErr w:type="spellStart"/>
-      <w:r>
-        <w:rPr>
-          <w:rStyle w:val="Titre3Car"/>
-        </w:rPr>
-        <w:t>Dictionnaire</w:t>
-      </w:r>
-      <w:proofErr w:type="spellEnd"/>
-      <w:r>
-        <w:rPr>
-          <w:rStyle w:val="Titre3Car"/>
-        </w:rPr>
-        <w:t xml:space="preserve"> des </w:t>
-      </w:r>
-      <w:proofErr w:type="spellStart"/>
-      <w:r>
-        <w:rPr>
-          <w:rStyle w:val="Titre3Car"/>
-        </w:rPr>
-        <w:t>données</w:t>
-      </w:r>
-      <w:proofErr w:type="spellEnd"/>
-      <w:r>
-        <w:rPr>
-          <w:rStyle w:val="Titre3Car"/>
-        </w:rPr>
-        <w:t xml:space="preserve"> relatives aux formations et aux</w:t>
+        <w:t>5.2.2. Dictionnaire des données relatives aux formations et aux</w:t>
       </w:r>
       <w:r>
         <w:t xml:space="preserve"> inscriptions</w:t>
@@ -9890,21 +9804,8 @@
         </w:rPr>
       </w:pPr>
       <w:r>
-        <w:t xml:space="preserve">5.2.3. Supports de </w:t>
-      </w:r>
-      <w:proofErr w:type="spellStart"/>
-      <w:r>
-        <w:t>cours</w:t>
-      </w:r>
-      <w:proofErr w:type="spellEnd"/>
-      <w:r>
-        <w:t xml:space="preserve"> et </w:t>
-      </w:r>
-      <w:proofErr w:type="spellStart"/>
-      <w:r>
-        <w:t>évaluations</w:t>
-      </w:r>
-      <w:proofErr w:type="spellEnd"/>
+        <w:t>5.2.3. Supports de cours et évaluations</w:t>
+      </w:r>
     </w:p>
     <w:p>
       <w:pPr>
@@ -14125,13 +14026,8 @@
         </w:rPr>
       </w:pPr>
       <w:r>
-        <w:t xml:space="preserve">5.2.4. Forum et </w:t>
-      </w:r>
-      <w:proofErr w:type="spellStart"/>
-      <w:r>
-        <w:t>messagerie</w:t>
-      </w:r>
-      <w:proofErr w:type="spellEnd"/>
+        <w:t>5.2.4. Forum et messagerie</w:t>
+      </w:r>
     </w:p>
     <w:p>
       <w:pPr>
@@ -15199,29 +15095,8 @@
         </w:rPr>
       </w:pPr>
       <w:r>
-        <w:t xml:space="preserve">5.2.5. </w:t>
-      </w:r>
-      <w:proofErr w:type="spellStart"/>
-      <w:r>
-        <w:t>Gestion</w:t>
-      </w:r>
-      <w:proofErr w:type="spellEnd"/>
-      <w:r>
-        <w:t xml:space="preserve"> des </w:t>
-      </w:r>
-      <w:proofErr w:type="spellStart"/>
-      <w:r>
-        <w:t>utilisateurs</w:t>
-      </w:r>
-      <w:proofErr w:type="spellEnd"/>
-      <w:r>
-        <w:t xml:space="preserve"> et des </w:t>
-      </w:r>
-      <w:proofErr w:type="spellStart"/>
-      <w:r>
-        <w:t>profils</w:t>
-      </w:r>
-      <w:proofErr w:type="spellEnd"/>
+        <w:t>5.2.5. Gestion des utilisateurs et des profils</w:t>
+      </w:r>
     </w:p>
     <w:p>
       <w:pPr>
@@ -19154,21 +19029,8 @@
         </w:rPr>
       </w:pPr>
       <w:r>
-        <w:t xml:space="preserve">5.2.3. </w:t>
-      </w:r>
-      <w:proofErr w:type="spellStart"/>
-      <w:r>
-        <w:t>Règles</w:t>
-      </w:r>
-      <w:proofErr w:type="spellEnd"/>
-      <w:r>
-        <w:t xml:space="preserve"> de </w:t>
-      </w:r>
-      <w:proofErr w:type="spellStart"/>
-      <w:r>
-        <w:t>gestion</w:t>
-      </w:r>
-      <w:proofErr w:type="spellEnd"/>
+        <w:t>5.2.3. Règles de gestion</w:t>
+      </w:r>
     </w:p>
     <w:p>
       <w:pPr>
@@ -19188,8 +19050,215 @@
     </w:p>
     <w:p>
       <w:pPr>
+        <w:rPr>
+          <w:b/>
+          <w:sz w:val="27"/>
+          <w:szCs w:val="27"/>
+        </w:rPr>
+      </w:pPr>
+      <w:r>
+        <w:rPr>
+          <w:b/>
+        </w:rPr>
+        <w:t>Règles de gestion de l’Administrateur</w:t>
+      </w:r>
+    </w:p>
+    <w:p>
+      <w:pPr>
         <w:pStyle w:val="NormalWeb"/>
       </w:pPr>
+      <w:r>
+        <w:t>L’administrateur assure la gestion des comptes utilisateurs de la plateforme. Il dispose des droits nécessaires pour créer, activer, désactiver et supprimer les comptes, ainsi que pour consulter certaines informations relatives aux candidatures et aux formations.</w:t>
+      </w:r>
+    </w:p>
+    <w:p>
+      <w:pPr>
+        <w:pStyle w:val="NormalWeb"/>
+      </w:pPr>
+      <w:r>
+        <w:t>Les règles de gestion associées à cet acteur sont les suivantes :</w:t>
+      </w:r>
+    </w:p>
+    <w:p>
+      <w:pPr>
+        <w:pStyle w:val="NormalWeb"/>
+        <w:numPr>
+          <w:ilvl w:val="0"/>
+          <w:numId w:val="21"/>
+        </w:numPr>
+        <w:jc w:val="left"/>
+      </w:pPr>
+      <w:r>
+        <w:rPr>
+          <w:rStyle w:val="lev"/>
+          <w:rFonts w:eastAsiaTheme="majorEastAsia"/>
+        </w:rPr>
+        <w:t>RG-ADM-01 : Création des comptes professionnels.</w:t>
+      </w:r>
+      <w:r>
+        <w:t xml:space="preserve"> L’administrateur crée manuellement les comptes des utilisateurs professionnels de la plateforme.</w:t>
+      </w:r>
+    </w:p>
+    <w:p>
+      <w:pPr>
+        <w:pStyle w:val="NormalWeb"/>
+        <w:numPr>
+          <w:ilvl w:val="0"/>
+          <w:numId w:val="21"/>
+        </w:numPr>
+        <w:jc w:val="left"/>
+      </w:pPr>
+      <w:r>
+        <w:rPr>
+          <w:rStyle w:val="lev"/>
+          <w:rFonts w:eastAsiaTheme="majorEastAsia"/>
+        </w:rPr>
+        <w:t>RG-ADM-02 : Gestion de l’état des comptes.</w:t>
+      </w:r>
+      <w:r>
+        <w:t xml:space="preserve"> L’administrateur peut activer ou désactiver un compte utilisateur selon les besoins de gestion de la plateforme.</w:t>
+      </w:r>
+    </w:p>
+    <w:p>
+      <w:pPr>
+        <w:pStyle w:val="NormalWeb"/>
+        <w:numPr>
+          <w:ilvl w:val="0"/>
+          <w:numId w:val="21"/>
+        </w:numPr>
+        <w:jc w:val="left"/>
+      </w:pPr>
+      <w:r>
+        <w:rPr>
+          <w:rStyle w:val="lev"/>
+          <w:rFonts w:eastAsiaTheme="majorEastAsia"/>
+        </w:rPr>
+        <w:t>RG-ADM-03 : Attribution des rôles.</w:t>
+      </w:r>
+      <w:r>
+        <w:t xml:space="preserve"> Le rôle d’un utilisateur est défini lors de la création de son compte. Une fois le compte créé, l’administrateur ne peut plus modifier ce rôle.</w:t>
+      </w:r>
+    </w:p>
+    <w:p>
+      <w:pPr>
+        <w:pStyle w:val="NormalWeb"/>
+        <w:numPr>
+          <w:ilvl w:val="0"/>
+          <w:numId w:val="21"/>
+        </w:numPr>
+        <w:jc w:val="left"/>
+      </w:pPr>
+      <w:r>
+        <w:rPr>
+          <w:rStyle w:val="lev"/>
+          <w:rFonts w:eastAsiaTheme="majorEastAsia"/>
+        </w:rPr>
+        <w:t>RG-ADM-04 : Gestion des administrateurs et des responsables.</w:t>
+      </w:r>
+      <w:r>
+        <w:t xml:space="preserve"> L’administrateur peut gérer les comptes des autres administrateurs et des responsables, notamment en créant, activant, désactivant ou supprimant leurs comptes.</w:t>
+      </w:r>
+    </w:p>
+    <w:p>
+      <w:pPr>
+        <w:pStyle w:val="NormalWeb"/>
+        <w:numPr>
+          <w:ilvl w:val="0"/>
+          <w:numId w:val="21"/>
+        </w:numPr>
+        <w:jc w:val="left"/>
+      </w:pPr>
+      <w:r>
+        <w:rPr>
+          <w:rStyle w:val="lev"/>
+          <w:rFonts w:eastAsiaTheme="majorEastAsia"/>
+        </w:rPr>
+        <w:t>RG-ADM-05 : Suppression des comptes utilisateurs.</w:t>
+      </w:r>
+      <w:r>
+        <w:t xml:space="preserve"> L’administrateur peut supprimer un compte utilisateur. Cette suppression entraîne la disparition du compte et de son accès aux fonctionnalités de la plateforme, sans supprimer les données historiques qui doivent être conservées.</w:t>
+      </w:r>
+    </w:p>
+    <w:p>
+      <w:pPr>
+        <w:pStyle w:val="NormalWeb"/>
+        <w:numPr>
+          <w:ilvl w:val="0"/>
+          <w:numId w:val="21"/>
+        </w:numPr>
+        <w:jc w:val="left"/>
+      </w:pPr>
+      <w:r>
+        <w:rPr>
+          <w:rStyle w:val="lev"/>
+          <w:rFonts w:eastAsiaTheme="majorEastAsia"/>
+        </w:rPr>
+        <w:t>RG-ADM-06 : Conservation des données historiques.</w:t>
+      </w:r>
+      <w:r>
+        <w:t xml:space="preserve"> La suppression d’un compte ne doit pas entraîner la suppression des informations relatives aux candidatures, aux présences, aux résultats des évaluations et aux certifications. Ces données sont conservées afin de préserver l’historique des activités réalisées sur la plateforme.</w:t>
+      </w:r>
+    </w:p>
+    <w:p>
+      <w:pPr>
+        <w:pStyle w:val="NormalWeb"/>
+        <w:numPr>
+          <w:ilvl w:val="0"/>
+          <w:numId w:val="21"/>
+        </w:numPr>
+        <w:jc w:val="left"/>
+      </w:pPr>
+      <w:r>
+        <w:rPr>
+          <w:rStyle w:val="lev"/>
+          <w:rFonts w:eastAsiaTheme="majorEastAsia"/>
+        </w:rPr>
+        <w:t>RG-ADM-07 : Consultation des candidatures.</w:t>
+      </w:r>
+      <w:r>
+        <w:t xml:space="preserve"> L’administrateur peut consulter les informations relatives aux candidatures des candidats inscrits aux formations.</w:t>
+      </w:r>
+    </w:p>
+    <w:p>
+      <w:pPr>
+        <w:pStyle w:val="NormalWeb"/>
+        <w:numPr>
+          <w:ilvl w:val="0"/>
+          <w:numId w:val="21"/>
+        </w:numPr>
+        <w:jc w:val="left"/>
+      </w:pPr>
+      <w:r>
+        <w:rPr>
+          <w:rStyle w:val="lev"/>
+          <w:rFonts w:eastAsiaTheme="majorEastAsia"/>
+        </w:rPr>
+        <w:t>RG-ADM-08 : Consultation des formations et des statistiques.</w:t>
+      </w:r>
+      <w:r>
+        <w:t xml:space="preserve"> L’administrateur peut consulter les informations relatives aux formations ainsi que les statistiques associées, afin de disposer d’une vue d’ensemble de l’activité de la plateforme.</w:t>
+      </w:r>
+    </w:p>
+    <w:p>
+      <w:pPr>
+        <w:pStyle w:val="NormalWeb"/>
+        <w:numPr>
+          <w:ilvl w:val="0"/>
+          <w:numId w:val="21"/>
+        </w:numPr>
+        <w:jc w:val="left"/>
+      </w:pPr>
+      <w:r>
+        <w:rPr>
+          <w:rStyle w:val="lev"/>
+          <w:rFonts w:eastAsiaTheme="majorEastAsia"/>
+        </w:rPr>
+        <w:lastRenderedPageBreak/>
+        <w:t>RG-ADM-09 : Accès aux fonctionnalités après une formation.</w:t>
+      </w:r>
+      <w:r>
+        <w:t xml:space="preserve"> L’accès aux fonctionnalités liées à une formation terminée, notamment le forum correspondant, peut être limité pour l’apprenant concerné. Cette limitation ne doit toutefois pas empêcher l’apprenant d’accéder aux fonctionnalités des autres formations auxquelles il participe encore ou auxquelles il est inscrit.</w:t>
+      </w:r>
     </w:p>
     <w:p>
       <w:pPr>
@@ -19197,6 +19266,11 @@
       </w:pPr>
       <w:bookmarkStart w:id="0" w:name="_GoBack"/>
       <w:bookmarkEnd w:id="0"/>
+    </w:p>
+    <w:p>
+      <w:pPr>
+        <w:pStyle w:val="NormalWeb"/>
+      </w:pPr>
     </w:p>
     <w:p>
       <w:pPr>
@@ -20573,9 +20647,9 @@
     </w:lvl>
   </w:abstractNum>
   <w:abstractNum w:abstractNumId="8">
-    <w:nsid w:val="2B081F88"/>
+    <w:nsid w:val="296E2744"/>
     <w:multiLevelType w:val="multilevel"/>
-    <w:tmpl w:val="A2E80B60"/>
+    <w:tmpl w:val="22CC32EE"/>
     <w:lvl w:ilvl="0">
       <w:start w:val="1"/>
       <w:numFmt w:val="bullet"/>
@@ -20722,9 +20796,9 @@
     </w:lvl>
   </w:abstractNum>
   <w:abstractNum w:abstractNumId="9">
-    <w:nsid w:val="2DAA1D07"/>
+    <w:nsid w:val="2B081F88"/>
     <w:multiLevelType w:val="multilevel"/>
-    <w:tmpl w:val="83F6DA5A"/>
+    <w:tmpl w:val="A2E80B60"/>
     <w:lvl w:ilvl="0">
       <w:start w:val="1"/>
       <w:numFmt w:val="bullet"/>
@@ -20871,122 +20945,9 @@
     </w:lvl>
   </w:abstractNum>
   <w:abstractNum w:abstractNumId="10">
-    <w:nsid w:val="31DD163B"/>
+    <w:nsid w:val="2DAA1D07"/>
     <w:multiLevelType w:val="multilevel"/>
-    <w:tmpl w:val="1C4AC220"/>
-    <w:lvl w:ilvl="0">
-      <w:start w:val="5"/>
-      <w:numFmt w:val="decimal"/>
-      <w:lvlText w:val="%1."/>
-      <w:lvlJc w:val="left"/>
-      <w:pPr>
-        <w:tabs>
-          <w:tab w:val="num" w:pos="720"/>
-        </w:tabs>
-        <w:ind w:left="720" w:hanging="360"/>
-      </w:pPr>
-    </w:lvl>
-    <w:lvl w:ilvl="1" w:tentative="1">
-      <w:start w:val="1"/>
-      <w:numFmt w:val="decimal"/>
-      <w:lvlText w:val="%2."/>
-      <w:lvlJc w:val="left"/>
-      <w:pPr>
-        <w:tabs>
-          <w:tab w:val="num" w:pos="1440"/>
-        </w:tabs>
-        <w:ind w:left="1440" w:hanging="360"/>
-      </w:pPr>
-    </w:lvl>
-    <w:lvl w:ilvl="2" w:tentative="1">
-      <w:start w:val="1"/>
-      <w:numFmt w:val="decimal"/>
-      <w:lvlText w:val="%3."/>
-      <w:lvlJc w:val="left"/>
-      <w:pPr>
-        <w:tabs>
-          <w:tab w:val="num" w:pos="2160"/>
-        </w:tabs>
-        <w:ind w:left="2160" w:hanging="360"/>
-      </w:pPr>
-    </w:lvl>
-    <w:lvl w:ilvl="3" w:tentative="1">
-      <w:start w:val="1"/>
-      <w:numFmt w:val="decimal"/>
-      <w:lvlText w:val="%4."/>
-      <w:lvlJc w:val="left"/>
-      <w:pPr>
-        <w:tabs>
-          <w:tab w:val="num" w:pos="2880"/>
-        </w:tabs>
-        <w:ind w:left="2880" w:hanging="360"/>
-      </w:pPr>
-    </w:lvl>
-    <w:lvl w:ilvl="4" w:tentative="1">
-      <w:start w:val="1"/>
-      <w:numFmt w:val="decimal"/>
-      <w:lvlText w:val="%5."/>
-      <w:lvlJc w:val="left"/>
-      <w:pPr>
-        <w:tabs>
-          <w:tab w:val="num" w:pos="3600"/>
-        </w:tabs>
-        <w:ind w:left="3600" w:hanging="360"/>
-      </w:pPr>
-    </w:lvl>
-    <w:lvl w:ilvl="5" w:tentative="1">
-      <w:start w:val="1"/>
-      <w:numFmt w:val="decimal"/>
-      <w:lvlText w:val="%6."/>
-      <w:lvlJc w:val="left"/>
-      <w:pPr>
-        <w:tabs>
-          <w:tab w:val="num" w:pos="4320"/>
-        </w:tabs>
-        <w:ind w:left="4320" w:hanging="360"/>
-      </w:pPr>
-    </w:lvl>
-    <w:lvl w:ilvl="6" w:tentative="1">
-      <w:start w:val="1"/>
-      <w:numFmt w:val="decimal"/>
-      <w:lvlText w:val="%7."/>
-      <w:lvlJc w:val="left"/>
-      <w:pPr>
-        <w:tabs>
-          <w:tab w:val="num" w:pos="5040"/>
-        </w:tabs>
-        <w:ind w:left="5040" w:hanging="360"/>
-      </w:pPr>
-    </w:lvl>
-    <w:lvl w:ilvl="7" w:tentative="1">
-      <w:start w:val="1"/>
-      <w:numFmt w:val="decimal"/>
-      <w:lvlText w:val="%8."/>
-      <w:lvlJc w:val="left"/>
-      <w:pPr>
-        <w:tabs>
-          <w:tab w:val="num" w:pos="5760"/>
-        </w:tabs>
-        <w:ind w:left="5760" w:hanging="360"/>
-      </w:pPr>
-    </w:lvl>
-    <w:lvl w:ilvl="8" w:tentative="1">
-      <w:start w:val="1"/>
-      <w:numFmt w:val="decimal"/>
-      <w:lvlText w:val="%9."/>
-      <w:lvlJc w:val="left"/>
-      <w:pPr>
-        <w:tabs>
-          <w:tab w:val="num" w:pos="6480"/>
-        </w:tabs>
-        <w:ind w:left="6480" w:hanging="360"/>
-      </w:pPr>
-    </w:lvl>
-  </w:abstractNum>
-  <w:abstractNum w:abstractNumId="11">
-    <w:nsid w:val="3B712F37"/>
-    <w:multiLevelType w:val="multilevel"/>
-    <w:tmpl w:val="24702A50"/>
+    <w:tmpl w:val="83F6DA5A"/>
     <w:lvl w:ilvl="0">
       <w:start w:val="1"/>
       <w:numFmt w:val="bullet"/>
@@ -21132,10 +21093,123 @@
       </w:rPr>
     </w:lvl>
   </w:abstractNum>
+  <w:abstractNum w:abstractNumId="11">
+    <w:nsid w:val="31DD163B"/>
+    <w:multiLevelType w:val="multilevel"/>
+    <w:tmpl w:val="1C4AC220"/>
+    <w:lvl w:ilvl="0">
+      <w:start w:val="5"/>
+      <w:numFmt w:val="decimal"/>
+      <w:lvlText w:val="%1."/>
+      <w:lvlJc w:val="left"/>
+      <w:pPr>
+        <w:tabs>
+          <w:tab w:val="num" w:pos="720"/>
+        </w:tabs>
+        <w:ind w:left="720" w:hanging="360"/>
+      </w:pPr>
+    </w:lvl>
+    <w:lvl w:ilvl="1" w:tentative="1">
+      <w:start w:val="1"/>
+      <w:numFmt w:val="decimal"/>
+      <w:lvlText w:val="%2."/>
+      <w:lvlJc w:val="left"/>
+      <w:pPr>
+        <w:tabs>
+          <w:tab w:val="num" w:pos="1440"/>
+        </w:tabs>
+        <w:ind w:left="1440" w:hanging="360"/>
+      </w:pPr>
+    </w:lvl>
+    <w:lvl w:ilvl="2" w:tentative="1">
+      <w:start w:val="1"/>
+      <w:numFmt w:val="decimal"/>
+      <w:lvlText w:val="%3."/>
+      <w:lvlJc w:val="left"/>
+      <w:pPr>
+        <w:tabs>
+          <w:tab w:val="num" w:pos="2160"/>
+        </w:tabs>
+        <w:ind w:left="2160" w:hanging="360"/>
+      </w:pPr>
+    </w:lvl>
+    <w:lvl w:ilvl="3" w:tentative="1">
+      <w:start w:val="1"/>
+      <w:numFmt w:val="decimal"/>
+      <w:lvlText w:val="%4."/>
+      <w:lvlJc w:val="left"/>
+      <w:pPr>
+        <w:tabs>
+          <w:tab w:val="num" w:pos="2880"/>
+        </w:tabs>
+        <w:ind w:left="2880" w:hanging="360"/>
+      </w:pPr>
+    </w:lvl>
+    <w:lvl w:ilvl="4" w:tentative="1">
+      <w:start w:val="1"/>
+      <w:numFmt w:val="decimal"/>
+      <w:lvlText w:val="%5."/>
+      <w:lvlJc w:val="left"/>
+      <w:pPr>
+        <w:tabs>
+          <w:tab w:val="num" w:pos="3600"/>
+        </w:tabs>
+        <w:ind w:left="3600" w:hanging="360"/>
+      </w:pPr>
+    </w:lvl>
+    <w:lvl w:ilvl="5" w:tentative="1">
+      <w:start w:val="1"/>
+      <w:numFmt w:val="decimal"/>
+      <w:lvlText w:val="%6."/>
+      <w:lvlJc w:val="left"/>
+      <w:pPr>
+        <w:tabs>
+          <w:tab w:val="num" w:pos="4320"/>
+        </w:tabs>
+        <w:ind w:left="4320" w:hanging="360"/>
+      </w:pPr>
+    </w:lvl>
+    <w:lvl w:ilvl="6" w:tentative="1">
+      <w:start w:val="1"/>
+      <w:numFmt w:val="decimal"/>
+      <w:lvlText w:val="%7."/>
+      <w:lvlJc w:val="left"/>
+      <w:pPr>
+        <w:tabs>
+          <w:tab w:val="num" w:pos="5040"/>
+        </w:tabs>
+        <w:ind w:left="5040" w:hanging="360"/>
+      </w:pPr>
+    </w:lvl>
+    <w:lvl w:ilvl="7" w:tentative="1">
+      <w:start w:val="1"/>
+      <w:numFmt w:val="decimal"/>
+      <w:lvlText w:val="%8."/>
+      <w:lvlJc w:val="left"/>
+      <w:pPr>
+        <w:tabs>
+          <w:tab w:val="num" w:pos="5760"/>
+        </w:tabs>
+        <w:ind w:left="5760" w:hanging="360"/>
+      </w:pPr>
+    </w:lvl>
+    <w:lvl w:ilvl="8" w:tentative="1">
+      <w:start w:val="1"/>
+      <w:numFmt w:val="decimal"/>
+      <w:lvlText w:val="%9."/>
+      <w:lvlJc w:val="left"/>
+      <w:pPr>
+        <w:tabs>
+          <w:tab w:val="num" w:pos="6480"/>
+        </w:tabs>
+        <w:ind w:left="6480" w:hanging="360"/>
+      </w:pPr>
+    </w:lvl>
+  </w:abstractNum>
   <w:abstractNum w:abstractNumId="12">
-    <w:nsid w:val="4171424E"/>
+    <w:nsid w:val="3B712F37"/>
     <w:multiLevelType w:val="multilevel"/>
-    <w:tmpl w:val="D5E688BE"/>
+    <w:tmpl w:val="24702A50"/>
     <w:lvl w:ilvl="0">
       <w:start w:val="1"/>
       <w:numFmt w:val="bullet"/>
@@ -21282,9 +21356,9 @@
     </w:lvl>
   </w:abstractNum>
   <w:abstractNum w:abstractNumId="13">
-    <w:nsid w:val="45853D38"/>
+    <w:nsid w:val="4171424E"/>
     <w:multiLevelType w:val="multilevel"/>
-    <w:tmpl w:val="99BA1572"/>
+    <w:tmpl w:val="D5E688BE"/>
     <w:lvl w:ilvl="0">
       <w:start w:val="1"/>
       <w:numFmt w:val="bullet"/>
@@ -21431,9 +21505,9 @@
     </w:lvl>
   </w:abstractNum>
   <w:abstractNum w:abstractNumId="14">
-    <w:nsid w:val="4DD2451C"/>
+    <w:nsid w:val="45853D38"/>
     <w:multiLevelType w:val="multilevel"/>
-    <w:tmpl w:val="0FB6F6DE"/>
+    <w:tmpl w:val="99BA1572"/>
     <w:lvl w:ilvl="0">
       <w:start w:val="1"/>
       <w:numFmt w:val="bullet"/>
@@ -21580,122 +21654,9 @@
     </w:lvl>
   </w:abstractNum>
   <w:abstractNum w:abstractNumId="15">
-    <w:nsid w:val="543F3990"/>
+    <w:nsid w:val="4DD2451C"/>
     <w:multiLevelType w:val="multilevel"/>
-    <w:tmpl w:val="278A675E"/>
-    <w:lvl w:ilvl="0">
-      <w:start w:val="1"/>
-      <w:numFmt w:val="decimal"/>
-      <w:lvlText w:val="%1."/>
-      <w:lvlJc w:val="left"/>
-      <w:pPr>
-        <w:tabs>
-          <w:tab w:val="num" w:pos="720"/>
-        </w:tabs>
-        <w:ind w:left="720" w:hanging="360"/>
-      </w:pPr>
-    </w:lvl>
-    <w:lvl w:ilvl="1" w:tentative="1">
-      <w:start w:val="1"/>
-      <w:numFmt w:val="decimal"/>
-      <w:lvlText w:val="%2."/>
-      <w:lvlJc w:val="left"/>
-      <w:pPr>
-        <w:tabs>
-          <w:tab w:val="num" w:pos="1440"/>
-        </w:tabs>
-        <w:ind w:left="1440" w:hanging="360"/>
-      </w:pPr>
-    </w:lvl>
-    <w:lvl w:ilvl="2" w:tentative="1">
-      <w:start w:val="1"/>
-      <w:numFmt w:val="decimal"/>
-      <w:lvlText w:val="%3."/>
-      <w:lvlJc w:val="left"/>
-      <w:pPr>
-        <w:tabs>
-          <w:tab w:val="num" w:pos="2160"/>
-        </w:tabs>
-        <w:ind w:left="2160" w:hanging="360"/>
-      </w:pPr>
-    </w:lvl>
-    <w:lvl w:ilvl="3" w:tentative="1">
-      <w:start w:val="1"/>
-      <w:numFmt w:val="decimal"/>
-      <w:lvlText w:val="%4."/>
-      <w:lvlJc w:val="left"/>
-      <w:pPr>
-        <w:tabs>
-          <w:tab w:val="num" w:pos="2880"/>
-        </w:tabs>
-        <w:ind w:left="2880" w:hanging="360"/>
-      </w:pPr>
-    </w:lvl>
-    <w:lvl w:ilvl="4" w:tentative="1">
-      <w:start w:val="1"/>
-      <w:numFmt w:val="decimal"/>
-      <w:lvlText w:val="%5."/>
-      <w:lvlJc w:val="left"/>
-      <w:pPr>
-        <w:tabs>
-          <w:tab w:val="num" w:pos="3600"/>
-        </w:tabs>
-        <w:ind w:left="3600" w:hanging="360"/>
-      </w:pPr>
-    </w:lvl>
-    <w:lvl w:ilvl="5" w:tentative="1">
-      <w:start w:val="1"/>
-      <w:numFmt w:val="decimal"/>
-      <w:lvlText w:val="%6."/>
-      <w:lvlJc w:val="left"/>
-      <w:pPr>
-        <w:tabs>
-          <w:tab w:val="num" w:pos="4320"/>
-        </w:tabs>
-        <w:ind w:left="4320" w:hanging="360"/>
-      </w:pPr>
-    </w:lvl>
-    <w:lvl w:ilvl="6" w:tentative="1">
-      <w:start w:val="1"/>
-      <w:numFmt w:val="decimal"/>
-      <w:lvlText w:val="%7."/>
-      <w:lvlJc w:val="left"/>
-      <w:pPr>
-        <w:tabs>
-          <w:tab w:val="num" w:pos="5040"/>
-        </w:tabs>
-        <w:ind w:left="5040" w:hanging="360"/>
-      </w:pPr>
-    </w:lvl>
-    <w:lvl w:ilvl="7" w:tentative="1">
-      <w:start w:val="1"/>
-      <w:numFmt w:val="decimal"/>
-      <w:lvlText w:val="%8."/>
-      <w:lvlJc w:val="left"/>
-      <w:pPr>
-        <w:tabs>
-          <w:tab w:val="num" w:pos="5760"/>
-        </w:tabs>
-        <w:ind w:left="5760" w:hanging="360"/>
-      </w:pPr>
-    </w:lvl>
-    <w:lvl w:ilvl="8" w:tentative="1">
-      <w:start w:val="1"/>
-      <w:numFmt w:val="decimal"/>
-      <w:lvlText w:val="%9."/>
-      <w:lvlJc w:val="left"/>
-      <w:pPr>
-        <w:tabs>
-          <w:tab w:val="num" w:pos="6480"/>
-        </w:tabs>
-        <w:ind w:left="6480" w:hanging="360"/>
-      </w:pPr>
-    </w:lvl>
-  </w:abstractNum>
-  <w:abstractNum w:abstractNumId="16">
-    <w:nsid w:val="54796CC4"/>
-    <w:multiLevelType w:val="multilevel"/>
-    <w:tmpl w:val="AF527392"/>
+    <w:tmpl w:val="0FB6F6DE"/>
     <w:lvl w:ilvl="0">
       <w:start w:val="1"/>
       <w:numFmt w:val="bullet"/>
@@ -21841,10 +21802,123 @@
       </w:rPr>
     </w:lvl>
   </w:abstractNum>
+  <w:abstractNum w:abstractNumId="16">
+    <w:nsid w:val="543F3990"/>
+    <w:multiLevelType w:val="multilevel"/>
+    <w:tmpl w:val="278A675E"/>
+    <w:lvl w:ilvl="0">
+      <w:start w:val="1"/>
+      <w:numFmt w:val="decimal"/>
+      <w:lvlText w:val="%1."/>
+      <w:lvlJc w:val="left"/>
+      <w:pPr>
+        <w:tabs>
+          <w:tab w:val="num" w:pos="720"/>
+        </w:tabs>
+        <w:ind w:left="720" w:hanging="360"/>
+      </w:pPr>
+    </w:lvl>
+    <w:lvl w:ilvl="1" w:tentative="1">
+      <w:start w:val="1"/>
+      <w:numFmt w:val="decimal"/>
+      <w:lvlText w:val="%2."/>
+      <w:lvlJc w:val="left"/>
+      <w:pPr>
+        <w:tabs>
+          <w:tab w:val="num" w:pos="1440"/>
+        </w:tabs>
+        <w:ind w:left="1440" w:hanging="360"/>
+      </w:pPr>
+    </w:lvl>
+    <w:lvl w:ilvl="2" w:tentative="1">
+      <w:start w:val="1"/>
+      <w:numFmt w:val="decimal"/>
+      <w:lvlText w:val="%3."/>
+      <w:lvlJc w:val="left"/>
+      <w:pPr>
+        <w:tabs>
+          <w:tab w:val="num" w:pos="2160"/>
+        </w:tabs>
+        <w:ind w:left="2160" w:hanging="360"/>
+      </w:pPr>
+    </w:lvl>
+    <w:lvl w:ilvl="3" w:tentative="1">
+      <w:start w:val="1"/>
+      <w:numFmt w:val="decimal"/>
+      <w:lvlText w:val="%4."/>
+      <w:lvlJc w:val="left"/>
+      <w:pPr>
+        <w:tabs>
+          <w:tab w:val="num" w:pos="2880"/>
+        </w:tabs>
+        <w:ind w:left="2880" w:hanging="360"/>
+      </w:pPr>
+    </w:lvl>
+    <w:lvl w:ilvl="4" w:tentative="1">
+      <w:start w:val="1"/>
+      <w:numFmt w:val="decimal"/>
+      <w:lvlText w:val="%5."/>
+      <w:lvlJc w:val="left"/>
+      <w:pPr>
+        <w:tabs>
+          <w:tab w:val="num" w:pos="3600"/>
+        </w:tabs>
+        <w:ind w:left="3600" w:hanging="360"/>
+      </w:pPr>
+    </w:lvl>
+    <w:lvl w:ilvl="5" w:tentative="1">
+      <w:start w:val="1"/>
+      <w:numFmt w:val="decimal"/>
+      <w:lvlText w:val="%6."/>
+      <w:lvlJc w:val="left"/>
+      <w:pPr>
+        <w:tabs>
+          <w:tab w:val="num" w:pos="4320"/>
+        </w:tabs>
+        <w:ind w:left="4320" w:hanging="360"/>
+      </w:pPr>
+    </w:lvl>
+    <w:lvl w:ilvl="6" w:tentative="1">
+      <w:start w:val="1"/>
+      <w:numFmt w:val="decimal"/>
+      <w:lvlText w:val="%7."/>
+      <w:lvlJc w:val="left"/>
+      <w:pPr>
+        <w:tabs>
+          <w:tab w:val="num" w:pos="5040"/>
+        </w:tabs>
+        <w:ind w:left="5040" w:hanging="360"/>
+      </w:pPr>
+    </w:lvl>
+    <w:lvl w:ilvl="7" w:tentative="1">
+      <w:start w:val="1"/>
+      <w:numFmt w:val="decimal"/>
+      <w:lvlText w:val="%8."/>
+      <w:lvlJc w:val="left"/>
+      <w:pPr>
+        <w:tabs>
+          <w:tab w:val="num" w:pos="5760"/>
+        </w:tabs>
+        <w:ind w:left="5760" w:hanging="360"/>
+      </w:pPr>
+    </w:lvl>
+    <w:lvl w:ilvl="8" w:tentative="1">
+      <w:start w:val="1"/>
+      <w:numFmt w:val="decimal"/>
+      <w:lvlText w:val="%9."/>
+      <w:lvlJc w:val="left"/>
+      <w:pPr>
+        <w:tabs>
+          <w:tab w:val="num" w:pos="6480"/>
+        </w:tabs>
+        <w:ind w:left="6480" w:hanging="360"/>
+      </w:pPr>
+    </w:lvl>
+  </w:abstractNum>
   <w:abstractNum w:abstractNumId="17">
-    <w:nsid w:val="59177E40"/>
+    <w:nsid w:val="54796CC4"/>
     <w:multiLevelType w:val="multilevel"/>
-    <w:tmpl w:val="731A257A"/>
+    <w:tmpl w:val="AF527392"/>
     <w:lvl w:ilvl="0">
       <w:start w:val="1"/>
       <w:numFmt w:val="bullet"/>
@@ -21991,9 +22065,9 @@
     </w:lvl>
   </w:abstractNum>
   <w:abstractNum w:abstractNumId="18">
-    <w:nsid w:val="69012030"/>
+    <w:nsid w:val="59177E40"/>
     <w:multiLevelType w:val="multilevel"/>
-    <w:tmpl w:val="1C043F5E"/>
+    <w:tmpl w:val="731A257A"/>
     <w:lvl w:ilvl="0">
       <w:start w:val="1"/>
       <w:numFmt w:val="bullet"/>
@@ -22140,6 +22214,155 @@
     </w:lvl>
   </w:abstractNum>
   <w:abstractNum w:abstractNumId="19">
+    <w:nsid w:val="69012030"/>
+    <w:multiLevelType w:val="multilevel"/>
+    <w:tmpl w:val="1C043F5E"/>
+    <w:lvl w:ilvl="0">
+      <w:start w:val="1"/>
+      <w:numFmt w:val="bullet"/>
+      <w:lvlText w:val=""/>
+      <w:lvlJc w:val="left"/>
+      <w:pPr>
+        <w:tabs>
+          <w:tab w:val="num" w:pos="720"/>
+        </w:tabs>
+        <w:ind w:left="720" w:hanging="360"/>
+      </w:pPr>
+      <w:rPr>
+        <w:rFonts w:ascii="Symbol" w:hAnsi="Symbol" w:hint="default"/>
+        <w:sz w:val="20"/>
+      </w:rPr>
+    </w:lvl>
+    <w:lvl w:ilvl="1" w:tentative="1">
+      <w:start w:val="1"/>
+      <w:numFmt w:val="bullet"/>
+      <w:lvlText w:val="o"/>
+      <w:lvlJc w:val="left"/>
+      <w:pPr>
+        <w:tabs>
+          <w:tab w:val="num" w:pos="1440"/>
+        </w:tabs>
+        <w:ind w:left="1440" w:hanging="360"/>
+      </w:pPr>
+      <w:rPr>
+        <w:rFonts w:ascii="Courier New" w:hAnsi="Courier New" w:hint="default"/>
+        <w:sz w:val="20"/>
+      </w:rPr>
+    </w:lvl>
+    <w:lvl w:ilvl="2" w:tentative="1">
+      <w:start w:val="1"/>
+      <w:numFmt w:val="bullet"/>
+      <w:lvlText w:val=""/>
+      <w:lvlJc w:val="left"/>
+      <w:pPr>
+        <w:tabs>
+          <w:tab w:val="num" w:pos="2160"/>
+        </w:tabs>
+        <w:ind w:left="2160" w:hanging="360"/>
+      </w:pPr>
+      <w:rPr>
+        <w:rFonts w:ascii="Wingdings" w:hAnsi="Wingdings" w:hint="default"/>
+        <w:sz w:val="20"/>
+      </w:rPr>
+    </w:lvl>
+    <w:lvl w:ilvl="3" w:tentative="1">
+      <w:start w:val="1"/>
+      <w:numFmt w:val="bullet"/>
+      <w:lvlText w:val=""/>
+      <w:lvlJc w:val="left"/>
+      <w:pPr>
+        <w:tabs>
+          <w:tab w:val="num" w:pos="2880"/>
+        </w:tabs>
+        <w:ind w:left="2880" w:hanging="360"/>
+      </w:pPr>
+      <w:rPr>
+        <w:rFonts w:ascii="Wingdings" w:hAnsi="Wingdings" w:hint="default"/>
+        <w:sz w:val="20"/>
+      </w:rPr>
+    </w:lvl>
+    <w:lvl w:ilvl="4" w:tentative="1">
+      <w:start w:val="1"/>
+      <w:numFmt w:val="bullet"/>
+      <w:lvlText w:val=""/>
+      <w:lvlJc w:val="left"/>
+      <w:pPr>
+        <w:tabs>
+          <w:tab w:val="num" w:pos="3600"/>
+        </w:tabs>
+        <w:ind w:left="3600" w:hanging="360"/>
+      </w:pPr>
+      <w:rPr>
+        <w:rFonts w:ascii="Wingdings" w:hAnsi="Wingdings" w:hint="default"/>
+        <w:sz w:val="20"/>
+      </w:rPr>
+    </w:lvl>
+    <w:lvl w:ilvl="5" w:tentative="1">
+      <w:start w:val="1"/>
+      <w:numFmt w:val="bullet"/>
+      <w:lvlText w:val=""/>
+      <w:lvlJc w:val="left"/>
+      <w:pPr>
+        <w:tabs>
+          <w:tab w:val="num" w:pos="4320"/>
+        </w:tabs>
+        <w:ind w:left="4320" w:hanging="360"/>
+      </w:pPr>
+      <w:rPr>
+        <w:rFonts w:ascii="Wingdings" w:hAnsi="Wingdings" w:hint="default"/>
+        <w:sz w:val="20"/>
+      </w:rPr>
+    </w:lvl>
+    <w:lvl w:ilvl="6" w:tentative="1">
+      <w:start w:val="1"/>
+      <w:numFmt w:val="bullet"/>
+      <w:lvlText w:val=""/>
+      <w:lvlJc w:val="left"/>
+      <w:pPr>
+        <w:tabs>
+          <w:tab w:val="num" w:pos="5040"/>
+        </w:tabs>
+        <w:ind w:left="5040" w:hanging="360"/>
+      </w:pPr>
+      <w:rPr>
+        <w:rFonts w:ascii="Wingdings" w:hAnsi="Wingdings" w:hint="default"/>
+        <w:sz w:val="20"/>
+      </w:rPr>
+    </w:lvl>
+    <w:lvl w:ilvl="7" w:tentative="1">
+      <w:start w:val="1"/>
+      <w:numFmt w:val="bullet"/>
+      <w:lvlText w:val=""/>
+      <w:lvlJc w:val="left"/>
+      <w:pPr>
+        <w:tabs>
+          <w:tab w:val="num" w:pos="5760"/>
+        </w:tabs>
+        <w:ind w:left="5760" w:hanging="360"/>
+      </w:pPr>
+      <w:rPr>
+        <w:rFonts w:ascii="Wingdings" w:hAnsi="Wingdings" w:hint="default"/>
+        <w:sz w:val="20"/>
+      </w:rPr>
+    </w:lvl>
+    <w:lvl w:ilvl="8" w:tentative="1">
+      <w:start w:val="1"/>
+      <w:numFmt w:val="bullet"/>
+      <w:lvlText w:val=""/>
+      <w:lvlJc w:val="left"/>
+      <w:pPr>
+        <w:tabs>
+          <w:tab w:val="num" w:pos="6480"/>
+        </w:tabs>
+        <w:ind w:left="6480" w:hanging="360"/>
+      </w:pPr>
+      <w:rPr>
+        <w:rFonts w:ascii="Wingdings" w:hAnsi="Wingdings" w:hint="default"/>
+        <w:sz w:val="20"/>
+      </w:rPr>
+    </w:lvl>
+  </w:abstractNum>
+  <w:abstractNum w:abstractNumId="20">
     <w:nsid w:val="738E4F87"/>
     <w:multiLevelType w:val="multilevel"/>
     <w:tmpl w:val="5C6E6428"/>
@@ -22253,40 +22476,40 @@
     </w:lvl>
   </w:abstractNum>
   <w:num w:numId="1">
-    <w:abstractNumId w:val="12"/>
+    <w:abstractNumId w:val="13"/>
   </w:num>
   <w:num w:numId="2">
-    <w:abstractNumId w:val="8"/>
+    <w:abstractNumId w:val="9"/>
   </w:num>
   <w:num w:numId="3">
-    <w:abstractNumId w:val="15"/>
+    <w:abstractNumId w:val="16"/>
   </w:num>
   <w:num w:numId="4">
     <w:abstractNumId w:val="5"/>
   </w:num>
   <w:num w:numId="5">
-    <w:abstractNumId w:val="19"/>
+    <w:abstractNumId w:val="20"/>
   </w:num>
   <w:num w:numId="6">
-    <w:abstractNumId w:val="10"/>
+    <w:abstractNumId w:val="11"/>
   </w:num>
   <w:num w:numId="7">
     <w:abstractNumId w:val="4"/>
   </w:num>
   <w:num w:numId="8">
-    <w:abstractNumId w:val="18"/>
+    <w:abstractNumId w:val="19"/>
   </w:num>
   <w:num w:numId="9">
-    <w:abstractNumId w:val="13"/>
+    <w:abstractNumId w:val="14"/>
   </w:num>
   <w:num w:numId="10">
     <w:abstractNumId w:val="2"/>
   </w:num>
   <w:num w:numId="11">
-    <w:abstractNumId w:val="16"/>
+    <w:abstractNumId w:val="17"/>
   </w:num>
   <w:num w:numId="12">
-    <w:abstractNumId w:val="14"/>
+    <w:abstractNumId w:val="15"/>
   </w:num>
   <w:num w:numId="13">
     <w:abstractNumId w:val="7"/>
@@ -22298,19 +22521,22 @@
     <w:abstractNumId w:val="1"/>
   </w:num>
   <w:num w:numId="16">
-    <w:abstractNumId w:val="17"/>
+    <w:abstractNumId w:val="18"/>
   </w:num>
   <w:num w:numId="17">
     <w:abstractNumId w:val="6"/>
   </w:num>
   <w:num w:numId="18">
-    <w:abstractNumId w:val="11"/>
+    <w:abstractNumId w:val="12"/>
   </w:num>
   <w:num w:numId="19">
     <w:abstractNumId w:val="0"/>
   </w:num>
   <w:num w:numId="20">
-    <w:abstractNumId w:val="9"/>
+    <w:abstractNumId w:val="10"/>
+  </w:num>
+  <w:num w:numId="21">
+    <w:abstractNumId w:val="8"/>
   </w:num>
 </w:numbering>
 </file>
@@ -22810,6 +23036,7 @@
   <w:style w:type="character" w:default="1" w:styleId="Policepardfaut">
     <w:name w:val="Default Paragraph Font"/>
     <w:uiPriority w:val="1"/>
+    <w:semiHidden/>
     <w:unhideWhenUsed/>
   </w:style>
   <w:style w:type="table" w:default="1" w:styleId="TableauNormal">
@@ -23250,7 +23477,7 @@
 </file>
 
 <file path=customXml/itemProps1.xml><?xml version="1.0" encoding="utf-8"?>
-<ds:datastoreItem xmlns:ds="http://schemas.openxmlformats.org/officeDocument/2006/customXml" ds:itemID="{504C96A7-A716-4180-99E6-735DBC937BE3}">
+<ds:datastoreItem xmlns:ds="http://schemas.openxmlformats.org/officeDocument/2006/customXml" ds:itemID="{F57112A4-ACBD-4B3D-A358-52AAB49D98B8}">
   <ds:schemaRefs>
     <ds:schemaRef ds:uri="http://schemas.openxmlformats.org/officeDocument/2006/bibliography"/>
   </ds:schemaRefs>

</xml_diff>